<commit_message>
Fix table width and column overlap on Page 4 for Algorithm 1 and Algorithm 2
</commit_message>
<xml_diff>
--- a/Groundwater_STGNN_Research_Paper_FINAL.docx
+++ b/Groundwater_STGNN_Research_Paper_FINAL.docx
@@ -282,10 +282,10 @@
     </w:p>
     <w:tbl>
       <w:tblPr>
-        <w:tblW w:type="auto" w:w="0"/>
         <w:jc w:val="center"/>
+        <w:tblLook w:firstColumn="1" w:firstRow="1" w:lastColumn="0" w:lastRow="0" w:noHBand="0" w:noVBand="1" w:val="04A0"/>
+        <w:tblW w:w="4392" w:type="dxa"/>
         <w:tblLayout w:type="fixed"/>
-        <w:tblLook w:firstColumn="1" w:firstRow="1" w:lastColumn="0" w:lastRow="0" w:noHBand="0" w:noVBand="1" w:val="04A0"/>
       </w:tblPr>
       <w:tblGrid>
         <w:gridCol w:w="10080"/>
@@ -509,9 +509,7 @@
     </w:p>
     <w:tbl>
       <w:tblPr>
-        <w:tblW w:type="auto" w:w="0"/>
         <w:jc w:val="center"/>
-        <w:tblLayout w:type="fixed"/>
         <w:tblLook w:firstColumn="1" w:firstRow="1" w:lastColumn="0" w:lastRow="0" w:noHBand="0" w:noVBand="1" w:val="04A0"/>
         <w:tblBorders>
           <w:top w:val="single" w:sz="4" w:space="0" w:color="B0B0B0"/>
@@ -521,6 +519,8 @@
           <w:insideH w:val="single" w:sz="4" w:space="0" w:color="B0B0B0"/>
           <w:insideV w:val="none"/>
         </w:tblBorders>
+        <w:tblW w:w="4608" w:type="dxa"/>
+        <w:tblLayout w:type="fixed"/>
       </w:tblPr>
       <w:tblGrid>
         <w:gridCol w:w="2520"/>
@@ -1335,10 +1335,10 @@
     </w:p>
     <w:tbl>
       <w:tblPr>
-        <w:tblW w:type="auto" w:w="0"/>
         <w:jc w:val="center"/>
+        <w:tblLook w:firstColumn="1" w:firstRow="1" w:lastColumn="0" w:lastRow="0" w:noHBand="0" w:noVBand="1" w:val="04A0"/>
+        <w:tblW w:w="4392" w:type="dxa"/>
         <w:tblLayout w:type="fixed"/>
-        <w:tblLook w:firstColumn="1" w:firstRow="1" w:lastColumn="0" w:lastRow="0" w:noHBand="0" w:noVBand="1" w:val="04A0"/>
       </w:tblPr>
       <w:tblGrid>
         <w:gridCol w:w="10080"/>
@@ -1771,10 +1771,10 @@
     </w:p>
     <w:tbl>
       <w:tblPr>
-        <w:tblW w:type="auto" w:w="0"/>
         <w:jc w:val="center"/>
+        <w:tblLook w:firstColumn="1" w:firstRow="1" w:lastColumn="0" w:lastRow="0" w:noHBand="0" w:noVBand="1" w:val="04A0"/>
+        <w:tblW w:w="4392" w:type="dxa"/>
         <w:tblLayout w:type="fixed"/>
-        <w:tblLook w:firstColumn="1" w:firstRow="1" w:lastColumn="0" w:lastRow="0" w:noHBand="0" w:noVBand="1" w:val="04A0"/>
       </w:tblPr>
       <w:tblGrid>
         <w:gridCol w:w="10080"/>
@@ -1900,10 +1900,10 @@
     </w:p>
     <w:tbl>
       <w:tblPr>
-        <w:tblW w:type="auto" w:w="0"/>
         <w:jc w:val="center"/>
+        <w:tblLook w:firstColumn="1" w:firstRow="1" w:lastColumn="0" w:lastRow="0" w:noHBand="0" w:noVBand="1" w:val="04A0"/>
+        <w:tblW w:w="4536" w:type="dxa"/>
         <w:tblLayout w:type="fixed"/>
-        <w:tblLook w:firstColumn="1" w:firstRow="1" w:lastColumn="0" w:lastRow="0" w:noHBand="0" w:noVBand="1" w:val="04A0"/>
         <w:tblBorders>
           <w:top w:val="single" w:sz="6" w:space="0" w:color="1B365D"/>
           <w:bottom w:val="single" w:sz="6" w:space="0" w:color="1B365D"/>
@@ -1914,18 +1914,18 @@
         </w:tblBorders>
       </w:tblPr>
       <w:tblGrid>
-        <w:gridCol w:w="4608"/>
+        <w:gridCol w:w="4536"/>
       </w:tblGrid>
       <w:tr>
         <w:tc>
           <w:tcPr>
-            <w:tcW w:type="dxa" w:w="10080"/>
+            <w:tcW w:w="4536" w:type="dxa"/>
             <w:shd w:fill="FAFBFC"/>
             <w:tcMar>
-              <w:top w:w="45" w:type="dxa"/>
-              <w:bottom w:w="45" w:type="dxa"/>
-              <w:left w:w="50" w:type="dxa"/>
-              <w:right w:w="50" w:type="dxa"/>
+              <w:top w:w="40" w:type="dxa"/>
+              <w:bottom w:w="40" w:type="dxa"/>
+              <w:left w:w="45" w:type="dxa"/>
+              <w:right w:w="45" w:type="dxa"/>
             </w:tcMar>
           </w:tcPr>
           <w:p>
@@ -2143,15 +2143,15 @@
     </w:tbl>
     <w:p>
       <w:pPr>
-        <w:spacing w:before="0" w:after="100"/>
+        <w:spacing w:before="0" w:after="100" w:line="240" w:lineRule="auto"/>
       </w:pPr>
     </w:p>
     <w:tbl>
       <w:tblPr>
-        <w:tblW w:type="auto" w:w="0"/>
         <w:jc w:val="center"/>
+        <w:tblLook w:firstColumn="1" w:firstRow="1" w:lastColumn="0" w:lastRow="0" w:noHBand="0" w:noVBand="1" w:val="04A0"/>
+        <w:tblW w:w="4536" w:type="dxa"/>
         <w:tblLayout w:type="fixed"/>
-        <w:tblLook w:firstColumn="1" w:firstRow="1" w:lastColumn="0" w:lastRow="0" w:noHBand="0" w:noVBand="1" w:val="04A0"/>
         <w:tblBorders>
           <w:top w:val="single" w:sz="6" w:space="0" w:color="1B365D"/>
           <w:bottom w:val="single" w:sz="6" w:space="0" w:color="1B365D"/>
@@ -2162,18 +2162,18 @@
         </w:tblBorders>
       </w:tblPr>
       <w:tblGrid>
-        <w:gridCol w:w="4608"/>
+        <w:gridCol w:w="4536"/>
       </w:tblGrid>
       <w:tr>
         <w:tc>
           <w:tcPr>
-            <w:tcW w:type="dxa" w:w="10080"/>
+            <w:tcW w:w="4536" w:type="dxa"/>
             <w:shd w:fill="FAFBFC"/>
             <w:tcMar>
-              <w:top w:w="45" w:type="dxa"/>
-              <w:bottom w:w="45" w:type="dxa"/>
-              <w:left w:w="50" w:type="dxa"/>
-              <w:right w:w="50" w:type="dxa"/>
+              <w:top w:w="40" w:type="dxa"/>
+              <w:bottom w:w="40" w:type="dxa"/>
+              <w:left w:w="45" w:type="dxa"/>
+              <w:right w:w="45" w:type="dxa"/>
             </w:tcMar>
           </w:tcPr>
           <w:p>
@@ -2433,7 +2433,7 @@
     </w:tbl>
     <w:p>
       <w:pPr>
-        <w:spacing w:before="0" w:after="100"/>
+        <w:spacing w:before="0" w:after="100" w:line="240" w:lineRule="auto"/>
       </w:pPr>
     </w:p>
     <w:p>
@@ -2468,9 +2468,7 @@
     </w:p>
     <w:tbl>
       <w:tblPr>
-        <w:tblW w:type="auto" w:w="0"/>
         <w:jc w:val="center"/>
-        <w:tblLayout w:type="fixed"/>
         <w:tblLook w:firstColumn="1" w:firstRow="1" w:lastColumn="0" w:lastRow="0" w:noHBand="0" w:noVBand="1" w:val="04A0"/>
         <w:tblBorders>
           <w:top w:val="single" w:sz="4" w:space="0" w:color="B0B0B0"/>
@@ -2480,6 +2478,8 @@
           <w:insideH w:val="single" w:sz="4" w:space="0" w:color="B0B0B0"/>
           <w:insideV w:val="none"/>
         </w:tblBorders>
+        <w:tblW w:w="4608" w:type="dxa"/>
+        <w:tblLayout w:type="fixed"/>
       </w:tblPr>
       <w:tblGrid>
         <w:gridCol w:w="2520"/>
@@ -3627,9 +3627,7 @@
     </w:p>
     <w:tbl>
       <w:tblPr>
-        <w:tblW w:type="auto" w:w="0"/>
         <w:jc w:val="center"/>
-        <w:tblLayout w:type="fixed"/>
         <w:tblLook w:firstColumn="1" w:firstRow="1" w:lastColumn="0" w:lastRow="0" w:noHBand="0" w:noVBand="1" w:val="04A0"/>
         <w:tblBorders>
           <w:top w:val="single" w:sz="4" w:space="0" w:color="B0B0B0"/>
@@ -3639,6 +3637,8 @@
           <w:insideH w:val="single" w:sz="4" w:space="0" w:color="B0B0B0"/>
           <w:insideV w:val="none"/>
         </w:tblBorders>
+        <w:tblW w:w="4608" w:type="dxa"/>
+        <w:tblLayout w:type="fixed"/>
       </w:tblPr>
       <w:tblGrid>
         <w:gridCol w:w="2520"/>
@@ -4206,9 +4206,7 @@
     </w:p>
     <w:tbl>
       <w:tblPr>
-        <w:tblW w:type="auto" w:w="0"/>
         <w:jc w:val="center"/>
-        <w:tblLayout w:type="fixed"/>
         <w:tblLook w:firstColumn="1" w:firstRow="1" w:lastColumn="0" w:lastRow="0" w:noHBand="0" w:noVBand="1" w:val="04A0"/>
         <w:tblBorders>
           <w:top w:val="single" w:sz="4" w:space="0" w:color="B0B0B0"/>
@@ -4218,6 +4216,8 @@
           <w:insideH w:val="single" w:sz="4" w:space="0" w:color="B0B0B0"/>
           <w:insideV w:val="none"/>
         </w:tblBorders>
+        <w:tblW w:w="4608" w:type="dxa"/>
+        <w:tblLayout w:type="fixed"/>
       </w:tblPr>
       <w:tblGrid>
         <w:gridCol w:w="2016"/>
@@ -5008,10 +5008,10 @@
     </w:p>
     <w:tbl>
       <w:tblPr>
-        <w:tblW w:type="auto" w:w="0"/>
         <w:jc w:val="center"/>
+        <w:tblLook w:firstColumn="1" w:firstRow="1" w:lastColumn="0" w:lastRow="0" w:noHBand="0" w:noVBand="1" w:val="04A0"/>
+        <w:tblW w:w="4392" w:type="dxa"/>
         <w:tblLayout w:type="fixed"/>
-        <w:tblLook w:firstColumn="1" w:firstRow="1" w:lastColumn="0" w:lastRow="0" w:noHBand="0" w:noVBand="1" w:val="04A0"/>
       </w:tblPr>
       <w:tblGrid>
         <w:gridCol w:w="10080"/>
@@ -5137,9 +5137,7 @@
     </w:p>
     <w:tbl>
       <w:tblPr>
-        <w:tblW w:type="auto" w:w="0"/>
         <w:jc w:val="center"/>
-        <w:tblLayout w:type="fixed"/>
         <w:tblLook w:firstColumn="1" w:firstRow="1" w:lastColumn="0" w:lastRow="0" w:noHBand="0" w:noVBand="1" w:val="04A0"/>
         <w:tblBorders>
           <w:top w:val="single" w:sz="4" w:space="0" w:color="B0B0B0"/>
@@ -5149,6 +5147,8 @@
           <w:insideH w:val="single" w:sz="4" w:space="0" w:color="B0B0B0"/>
           <w:insideV w:val="none"/>
         </w:tblBorders>
+        <w:tblW w:w="4320" w:type="dxa"/>
+        <w:tblLayout w:type="fixed"/>
       </w:tblPr>
       <w:tblGrid>
         <w:gridCol w:w="3360"/>
@@ -5665,10 +5665,10 @@
     </w:p>
     <w:tbl>
       <w:tblPr>
-        <w:tblW w:type="auto" w:w="0"/>
         <w:jc w:val="center"/>
+        <w:tblLook w:firstColumn="1" w:firstRow="1" w:lastColumn="0" w:lastRow="0" w:noHBand="0" w:noVBand="1" w:val="04A0"/>
+        <w:tblW w:w="4392" w:type="dxa"/>
         <w:tblLayout w:type="fixed"/>
-        <w:tblLook w:firstColumn="1" w:firstRow="1" w:lastColumn="0" w:lastRow="0" w:noHBand="0" w:noVBand="1" w:val="04A0"/>
       </w:tblPr>
       <w:tblGrid>
         <w:gridCol w:w="10080"/>
@@ -5764,10 +5764,10 @@
     </w:p>
     <w:tbl>
       <w:tblPr>
-        <w:tblW w:type="auto" w:w="0"/>
         <w:jc w:val="center"/>
+        <w:tblLook w:firstColumn="1" w:firstRow="1" w:lastColumn="0" w:lastRow="0" w:noHBand="0" w:noVBand="1" w:val="04A0"/>
+        <w:tblW w:w="4392" w:type="dxa"/>
         <w:tblLayout w:type="fixed"/>
-        <w:tblLook w:firstColumn="1" w:firstRow="1" w:lastColumn="0" w:lastRow="0" w:noHBand="0" w:noVBand="1" w:val="04A0"/>
       </w:tblPr>
       <w:tblGrid>
         <w:gridCol w:w="10080"/>

</xml_diff>

<commit_message>
Remove Member, IEEE and upgrade all 6 paper figures to 500 DPI high resolution
</commit_message>
<xml_diff>
--- a/Groundwater_STGNN_Research_Paper_FINAL.docx
+++ b/Groundwater_STGNN_Research_Paper_FINAL.docx
@@ -30,14 +30,6 @@
           <w:sz w:val="24"/>
         </w:rPr>
         <w:t>Kamaljit</w:t>
-      </w:r>
-      <w:r>
-        <w:rPr>
-          <w:rFonts w:ascii="Times New Roman" w:hAnsi="Times New Roman"/>
-          <w:i/>
-          <w:sz w:val="20"/>
-        </w:rPr>
-        <w:t>, Member, IEEE</w:t>
         <w:br/>
       </w:r>
     </w:p>
@@ -310,7 +302,7 @@
             <w:r>
               <w:drawing>
                 <wp:inline xmlns:a="http://schemas.openxmlformats.org/drawingml/2006/main" xmlns:pic="http://schemas.openxmlformats.org/drawingml/2006/picture">
-                  <wp:extent cx="2697479" cy="1450745"/>
+                  <wp:extent cx="2697479" cy="1484893"/>
                   <wp:docPr id="1" name="Picture 1"/>
                   <wp:cNvGraphicFramePr>
                     <a:graphicFrameLocks noChangeAspect="1"/>
@@ -331,7 +323,7 @@
                         <pic:spPr>
                           <a:xfrm>
                             <a:off x="0" y="0"/>
-                            <a:ext cx="2697479" cy="1450745"/>
+                            <a:ext cx="2697479" cy="1484893"/>
                           </a:xfrm>
                           <a:prstGeom prst="rect"/>
                         </pic:spPr>
@@ -1363,7 +1355,7 @@
             <w:r>
               <w:drawing>
                 <wp:inline xmlns:a="http://schemas.openxmlformats.org/drawingml/2006/main" xmlns:pic="http://schemas.openxmlformats.org/drawingml/2006/picture">
-                  <wp:extent cx="2697479" cy="1880061"/>
+                  <wp:extent cx="2697479" cy="1795447"/>
                   <wp:docPr id="2" name="Picture 2"/>
                   <wp:cNvGraphicFramePr>
                     <a:graphicFrameLocks noChangeAspect="1"/>
@@ -1384,7 +1376,7 @@
                         <pic:spPr>
                           <a:xfrm>
                             <a:off x="0" y="0"/>
-                            <a:ext cx="2697479" cy="1880061"/>
+                            <a:ext cx="2697479" cy="1795447"/>
                           </a:xfrm>
                           <a:prstGeom prst="rect"/>
                         </pic:spPr>
@@ -1799,7 +1791,7 @@
             <w:r>
               <w:drawing>
                 <wp:inline xmlns:a="http://schemas.openxmlformats.org/drawingml/2006/main" xmlns:pic="http://schemas.openxmlformats.org/drawingml/2006/picture">
-                  <wp:extent cx="2697479" cy="1091561"/>
+                  <wp:extent cx="2697479" cy="1218216"/>
                   <wp:docPr id="3" name="Picture 3"/>
                   <wp:cNvGraphicFramePr>
                     <a:graphicFrameLocks noChangeAspect="1"/>
@@ -1820,7 +1812,7 @@
                         <pic:spPr>
                           <a:xfrm>
                             <a:off x="0" y="0"/>
-                            <a:ext cx="2697479" cy="1091561"/>
+                            <a:ext cx="2697479" cy="1218216"/>
                           </a:xfrm>
                           <a:prstGeom prst="rect"/>
                         </pic:spPr>
@@ -5036,7 +5028,7 @@
             <w:r>
               <w:drawing>
                 <wp:inline xmlns:a="http://schemas.openxmlformats.org/drawingml/2006/main" xmlns:pic="http://schemas.openxmlformats.org/drawingml/2006/picture">
-                  <wp:extent cx="2697479" cy="1143440"/>
+                  <wp:extent cx="2697479" cy="1238187"/>
                   <wp:docPr id="4" name="Picture 4"/>
                   <wp:cNvGraphicFramePr>
                     <a:graphicFrameLocks noChangeAspect="1"/>
@@ -5057,7 +5049,7 @@
                         <pic:spPr>
                           <a:xfrm>
                             <a:off x="0" y="0"/>
-                            <a:ext cx="2697479" cy="1143440"/>
+                            <a:ext cx="2697479" cy="1238187"/>
                           </a:xfrm>
                           <a:prstGeom prst="rect"/>
                         </pic:spPr>
@@ -5693,7 +5685,7 @@
             <w:r>
               <w:drawing>
                 <wp:inline xmlns:a="http://schemas.openxmlformats.org/drawingml/2006/main" xmlns:pic="http://schemas.openxmlformats.org/drawingml/2006/picture">
-                  <wp:extent cx="2697479" cy="1880061"/>
+                  <wp:extent cx="2697479" cy="1836033"/>
                   <wp:docPr id="5" name="Picture 5"/>
                   <wp:cNvGraphicFramePr>
                     <a:graphicFrameLocks noChangeAspect="1"/>
@@ -5714,7 +5706,7 @@
                         <pic:spPr>
                           <a:xfrm>
                             <a:off x="0" y="0"/>
-                            <a:ext cx="2697479" cy="1880061"/>
+                            <a:ext cx="2697479" cy="1836033"/>
                           </a:xfrm>
                           <a:prstGeom prst="rect"/>
                         </pic:spPr>
@@ -5792,7 +5784,7 @@
             <w:r>
               <w:drawing>
                 <wp:inline xmlns:a="http://schemas.openxmlformats.org/drawingml/2006/main" xmlns:pic="http://schemas.openxmlformats.org/drawingml/2006/picture">
-                  <wp:extent cx="2697479" cy="1335116"/>
+                  <wp:extent cx="2697479" cy="1325880"/>
                   <wp:docPr id="6" name="Picture 6"/>
                   <wp:cNvGraphicFramePr>
                     <a:graphicFrameLocks noChangeAspect="1"/>
@@ -5813,7 +5805,7 @@
                         <pic:spPr>
                           <a:xfrm>
                             <a:off x="0" y="0"/>
-                            <a:ext cx="2697479" cy="1335116"/>
+                            <a:ext cx="2697479" cy="1325880"/>
                           </a:xfrm>
                           <a:prstGeom prst="rect"/>
                         </pic:spPr>

</xml_diff>

<commit_message>
Restore original patent figures with clean 10-page text formatting and Member, IEEE removed
</commit_message>
<xml_diff>
--- a/Groundwater_STGNN_Research_Paper_FINAL.docx
+++ b/Groundwater_STGNN_Research_Paper_FINAL.docx
@@ -302,7 +302,7 @@
             <w:r>
               <w:drawing>
                 <wp:inline xmlns:a="http://schemas.openxmlformats.org/drawingml/2006/main" xmlns:pic="http://schemas.openxmlformats.org/drawingml/2006/picture">
-                  <wp:extent cx="2697479" cy="1484893"/>
+                  <wp:extent cx="2697479" cy="1450745"/>
                   <wp:docPr id="1" name="Picture 1"/>
                   <wp:cNvGraphicFramePr>
                     <a:graphicFrameLocks noChangeAspect="1"/>
@@ -323,7 +323,7 @@
                         <pic:spPr>
                           <a:xfrm>
                             <a:off x="0" y="0"/>
-                            <a:ext cx="2697479" cy="1484893"/>
+                            <a:ext cx="2697479" cy="1450745"/>
                           </a:xfrm>
                           <a:prstGeom prst="rect"/>
                         </pic:spPr>
@@ -1355,7 +1355,7 @@
             <w:r>
               <w:drawing>
                 <wp:inline xmlns:a="http://schemas.openxmlformats.org/drawingml/2006/main" xmlns:pic="http://schemas.openxmlformats.org/drawingml/2006/picture">
-                  <wp:extent cx="2697479" cy="1795447"/>
+                  <wp:extent cx="2697479" cy="1880061"/>
                   <wp:docPr id="2" name="Picture 2"/>
                   <wp:cNvGraphicFramePr>
                     <a:graphicFrameLocks noChangeAspect="1"/>
@@ -1376,7 +1376,7 @@
                         <pic:spPr>
                           <a:xfrm>
                             <a:off x="0" y="0"/>
-                            <a:ext cx="2697479" cy="1795447"/>
+                            <a:ext cx="2697479" cy="1880061"/>
                           </a:xfrm>
                           <a:prstGeom prst="rect"/>
                         </pic:spPr>
@@ -1791,7 +1791,7 @@
             <w:r>
               <w:drawing>
                 <wp:inline xmlns:a="http://schemas.openxmlformats.org/drawingml/2006/main" xmlns:pic="http://schemas.openxmlformats.org/drawingml/2006/picture">
-                  <wp:extent cx="2697479" cy="1218216"/>
+                  <wp:extent cx="2697479" cy="1091561"/>
                   <wp:docPr id="3" name="Picture 3"/>
                   <wp:cNvGraphicFramePr>
                     <a:graphicFrameLocks noChangeAspect="1"/>
@@ -1812,7 +1812,7 @@
                         <pic:spPr>
                           <a:xfrm>
                             <a:off x="0" y="0"/>
-                            <a:ext cx="2697479" cy="1218216"/>
+                            <a:ext cx="2697479" cy="1091561"/>
                           </a:xfrm>
                           <a:prstGeom prst="rect"/>
                         </pic:spPr>
@@ -5028,7 +5028,7 @@
             <w:r>
               <w:drawing>
                 <wp:inline xmlns:a="http://schemas.openxmlformats.org/drawingml/2006/main" xmlns:pic="http://schemas.openxmlformats.org/drawingml/2006/picture">
-                  <wp:extent cx="2697479" cy="1238187"/>
+                  <wp:extent cx="2697479" cy="1143440"/>
                   <wp:docPr id="4" name="Picture 4"/>
                   <wp:cNvGraphicFramePr>
                     <a:graphicFrameLocks noChangeAspect="1"/>
@@ -5049,7 +5049,7 @@
                         <pic:spPr>
                           <a:xfrm>
                             <a:off x="0" y="0"/>
-                            <a:ext cx="2697479" cy="1238187"/>
+                            <a:ext cx="2697479" cy="1143440"/>
                           </a:xfrm>
                           <a:prstGeom prst="rect"/>
                         </pic:spPr>
@@ -5685,7 +5685,7 @@
             <w:r>
               <w:drawing>
                 <wp:inline xmlns:a="http://schemas.openxmlformats.org/drawingml/2006/main" xmlns:pic="http://schemas.openxmlformats.org/drawingml/2006/picture">
-                  <wp:extent cx="2697479" cy="1836033"/>
+                  <wp:extent cx="2697479" cy="1880061"/>
                   <wp:docPr id="5" name="Picture 5"/>
                   <wp:cNvGraphicFramePr>
                     <a:graphicFrameLocks noChangeAspect="1"/>
@@ -5706,7 +5706,7 @@
                         <pic:spPr>
                           <a:xfrm>
                             <a:off x="0" y="0"/>
-                            <a:ext cx="2697479" cy="1836033"/>
+                            <a:ext cx="2697479" cy="1880061"/>
                           </a:xfrm>
                           <a:prstGeom prst="rect"/>
                         </pic:spPr>
@@ -5784,7 +5784,7 @@
             <w:r>
               <w:drawing>
                 <wp:inline xmlns:a="http://schemas.openxmlformats.org/drawingml/2006/main" xmlns:pic="http://schemas.openxmlformats.org/drawingml/2006/picture">
-                  <wp:extent cx="2697479" cy="1325880"/>
+                  <wp:extent cx="2697479" cy="1335116"/>
                   <wp:docPr id="6" name="Picture 6"/>
                   <wp:cNvGraphicFramePr>
                     <a:graphicFrameLocks noChangeAspect="1"/>
@@ -5805,7 +5805,7 @@
                         <pic:spPr>
                           <a:xfrm>
                             <a:off x="0" y="0"/>
-                            <a:ext cx="2697479" cy="1325880"/>
+                            <a:ext cx="2697479" cy="1335116"/>
                           </a:xfrm>
                           <a:prstGeom prst="rect"/>
                         </pic:spPr>

</xml_diff>

<commit_message>
Fix blurry image text: Rebuild all 6 figures with large bold typography and 600 DPI for crystal clear readability
</commit_message>
<xml_diff>
--- a/Groundwater_STGNN_Research_Paper_FINAL.docx
+++ b/Groundwater_STGNN_Research_Paper_FINAL.docx
@@ -302,7 +302,7 @@
             <w:r>
               <w:drawing>
                 <wp:inline xmlns:a="http://schemas.openxmlformats.org/drawingml/2006/main" xmlns:pic="http://schemas.openxmlformats.org/drawingml/2006/picture">
-                  <wp:extent cx="2697479" cy="1450745"/>
+                  <wp:extent cx="2697479" cy="1432468"/>
                   <wp:docPr id="1" name="Picture 1"/>
                   <wp:cNvGraphicFramePr>
                     <a:graphicFrameLocks noChangeAspect="1"/>
@@ -323,7 +323,7 @@
                         <pic:spPr>
                           <a:xfrm>
                             <a:off x="0" y="0"/>
-                            <a:ext cx="2697479" cy="1450745"/>
+                            <a:ext cx="2697479" cy="1432468"/>
                           </a:xfrm>
                           <a:prstGeom prst="rect"/>
                         </pic:spPr>
@@ -1355,7 +1355,7 @@
             <w:r>
               <w:drawing>
                 <wp:inline xmlns:a="http://schemas.openxmlformats.org/drawingml/2006/main" xmlns:pic="http://schemas.openxmlformats.org/drawingml/2006/picture">
-                  <wp:extent cx="2697479" cy="1880061"/>
+                  <wp:extent cx="2697479" cy="1808180"/>
                   <wp:docPr id="2" name="Picture 2"/>
                   <wp:cNvGraphicFramePr>
                     <a:graphicFrameLocks noChangeAspect="1"/>
@@ -1376,7 +1376,7 @@
                         <pic:spPr>
                           <a:xfrm>
                             <a:off x="0" y="0"/>
-                            <a:ext cx="2697479" cy="1880061"/>
+                            <a:ext cx="2697479" cy="1808180"/>
                           </a:xfrm>
                           <a:prstGeom prst="rect"/>
                         </pic:spPr>
@@ -1791,7 +1791,7 @@
             <w:r>
               <w:drawing>
                 <wp:inline xmlns:a="http://schemas.openxmlformats.org/drawingml/2006/main" xmlns:pic="http://schemas.openxmlformats.org/drawingml/2006/picture">
-                  <wp:extent cx="2697479" cy="1091561"/>
+                  <wp:extent cx="2697479" cy="1186321"/>
                   <wp:docPr id="3" name="Picture 3"/>
                   <wp:cNvGraphicFramePr>
                     <a:graphicFrameLocks noChangeAspect="1"/>
@@ -1812,7 +1812,7 @@
                         <pic:spPr>
                           <a:xfrm>
                             <a:off x="0" y="0"/>
-                            <a:ext cx="2697479" cy="1091561"/>
+                            <a:ext cx="2697479" cy="1186321"/>
                           </a:xfrm>
                           <a:prstGeom prst="rect"/>
                         </pic:spPr>
@@ -5028,7 +5028,7 @@
             <w:r>
               <w:drawing>
                 <wp:inline xmlns:a="http://schemas.openxmlformats.org/drawingml/2006/main" xmlns:pic="http://schemas.openxmlformats.org/drawingml/2006/picture">
-                  <wp:extent cx="2697479" cy="1143440"/>
+                  <wp:extent cx="2697479" cy="1119708"/>
                   <wp:docPr id="4" name="Picture 4"/>
                   <wp:cNvGraphicFramePr>
                     <a:graphicFrameLocks noChangeAspect="1"/>
@@ -5049,7 +5049,7 @@
                         <pic:spPr>
                           <a:xfrm>
                             <a:off x="0" y="0"/>
-                            <a:ext cx="2697479" cy="1143440"/>
+                            <a:ext cx="2697479" cy="1119708"/>
                           </a:xfrm>
                           <a:prstGeom prst="rect"/>
                         </pic:spPr>
@@ -5685,7 +5685,7 @@
             <w:r>
               <w:drawing>
                 <wp:inline xmlns:a="http://schemas.openxmlformats.org/drawingml/2006/main" xmlns:pic="http://schemas.openxmlformats.org/drawingml/2006/picture">
-                  <wp:extent cx="2697479" cy="1880061"/>
+                  <wp:extent cx="2697479" cy="1547747"/>
                   <wp:docPr id="5" name="Picture 5"/>
                   <wp:cNvGraphicFramePr>
                     <a:graphicFrameLocks noChangeAspect="1"/>
@@ -5706,7 +5706,7 @@
                         <pic:spPr>
                           <a:xfrm>
                             <a:off x="0" y="0"/>
-                            <a:ext cx="2697479" cy="1880061"/>
+                            <a:ext cx="2697479" cy="1547747"/>
                           </a:xfrm>
                           <a:prstGeom prst="rect"/>
                         </pic:spPr>
@@ -5784,7 +5784,7 @@
             <w:r>
               <w:drawing>
                 <wp:inline xmlns:a="http://schemas.openxmlformats.org/drawingml/2006/main" xmlns:pic="http://schemas.openxmlformats.org/drawingml/2006/picture">
-                  <wp:extent cx="2697479" cy="1335116"/>
+                  <wp:extent cx="2697479" cy="1329651"/>
                   <wp:docPr id="6" name="Picture 6"/>
                   <wp:cNvGraphicFramePr>
                     <a:graphicFrameLocks noChangeAspect="1"/>
@@ -5805,7 +5805,7 @@
                         <pic:spPr>
                           <a:xfrm>
                             <a:off x="0" y="0"/>
-                            <a:ext cx="2697479" cy="1335116"/>
+                            <a:ext cx="2697479" cy="1329651"/>
                           </a:xfrm>
                           <a:prstGeom prst="rect"/>
                         </pic:spPr>

</xml_diff>

<commit_message>
Fix figure clarity at 400 DPI with zero text overlap, remove IEEE member tag, and calibrate exact 10-page IEEE paper
</commit_message>
<xml_diff>
--- a/Groundwater_STGNN_Research_Paper_FINAL.docx
+++ b/Groundwater_STGNN_Research_Paper_FINAL.docx
@@ -302,7 +302,7 @@
             <w:r>
               <w:drawing>
                 <wp:inline xmlns:a="http://schemas.openxmlformats.org/drawingml/2006/main" xmlns:pic="http://schemas.openxmlformats.org/drawingml/2006/picture">
-                  <wp:extent cx="2697479" cy="1432468"/>
+                  <wp:extent cx="2697479" cy="1339322"/>
                   <wp:docPr id="1" name="Picture 1"/>
                   <wp:cNvGraphicFramePr>
                     <a:graphicFrameLocks noChangeAspect="1"/>
@@ -323,7 +323,7 @@
                         <pic:spPr>
                           <a:xfrm>
                             <a:off x="0" y="0"/>
-                            <a:ext cx="2697479" cy="1432468"/>
+                            <a:ext cx="2697479" cy="1339322"/>
                           </a:xfrm>
                           <a:prstGeom prst="rect"/>
                         </pic:spPr>
@@ -1355,7 +1355,7 @@
             <w:r>
               <w:drawing>
                 <wp:inline xmlns:a="http://schemas.openxmlformats.org/drawingml/2006/main" xmlns:pic="http://schemas.openxmlformats.org/drawingml/2006/picture">
-                  <wp:extent cx="2697479" cy="1808180"/>
+                  <wp:extent cx="2697479" cy="1831316"/>
                   <wp:docPr id="2" name="Picture 2"/>
                   <wp:cNvGraphicFramePr>
                     <a:graphicFrameLocks noChangeAspect="1"/>
@@ -1376,7 +1376,7 @@
                         <pic:spPr>
                           <a:xfrm>
                             <a:off x="0" y="0"/>
-                            <a:ext cx="2697479" cy="1808180"/>
+                            <a:ext cx="2697479" cy="1831316"/>
                           </a:xfrm>
                           <a:prstGeom prst="rect"/>
                         </pic:spPr>
@@ -1791,7 +1791,7 @@
             <w:r>
               <w:drawing>
                 <wp:inline xmlns:a="http://schemas.openxmlformats.org/drawingml/2006/main" xmlns:pic="http://schemas.openxmlformats.org/drawingml/2006/picture">
-                  <wp:extent cx="2697479" cy="1186321"/>
+                  <wp:extent cx="2697479" cy="1114318"/>
                   <wp:docPr id="3" name="Picture 3"/>
                   <wp:cNvGraphicFramePr>
                     <a:graphicFrameLocks noChangeAspect="1"/>
@@ -1812,7 +1812,7 @@
                         <pic:spPr>
                           <a:xfrm>
                             <a:off x="0" y="0"/>
-                            <a:ext cx="2697479" cy="1186321"/>
+                            <a:ext cx="2697479" cy="1114318"/>
                           </a:xfrm>
                           <a:prstGeom prst="rect"/>
                         </pic:spPr>
@@ -5028,7 +5028,7 @@
             <w:r>
               <w:drawing>
                 <wp:inline xmlns:a="http://schemas.openxmlformats.org/drawingml/2006/main" xmlns:pic="http://schemas.openxmlformats.org/drawingml/2006/picture">
-                  <wp:extent cx="2697479" cy="1119708"/>
+                  <wp:extent cx="2697479" cy="1118496"/>
                   <wp:docPr id="4" name="Picture 4"/>
                   <wp:cNvGraphicFramePr>
                     <a:graphicFrameLocks noChangeAspect="1"/>
@@ -5049,7 +5049,7 @@
                         <pic:spPr>
                           <a:xfrm>
                             <a:off x="0" y="0"/>
-                            <a:ext cx="2697479" cy="1119708"/>
+                            <a:ext cx="2697479" cy="1118496"/>
                           </a:xfrm>
                           <a:prstGeom prst="rect"/>
                         </pic:spPr>
@@ -5685,7 +5685,7 @@
             <w:r>
               <w:drawing>
                 <wp:inline xmlns:a="http://schemas.openxmlformats.org/drawingml/2006/main" xmlns:pic="http://schemas.openxmlformats.org/drawingml/2006/picture">
-                  <wp:extent cx="2697479" cy="1547747"/>
+                  <wp:extent cx="2697479" cy="1841548"/>
                   <wp:docPr id="5" name="Picture 5"/>
                   <wp:cNvGraphicFramePr>
                     <a:graphicFrameLocks noChangeAspect="1"/>
@@ -5706,7 +5706,7 @@
                         <pic:spPr>
                           <a:xfrm>
                             <a:off x="0" y="0"/>
-                            <a:ext cx="2697479" cy="1547747"/>
+                            <a:ext cx="2697479" cy="1841548"/>
                           </a:xfrm>
                           <a:prstGeom prst="rect"/>
                         </pic:spPr>
@@ -5784,7 +5784,7 @@
             <w:r>
               <w:drawing>
                 <wp:inline xmlns:a="http://schemas.openxmlformats.org/drawingml/2006/main" xmlns:pic="http://schemas.openxmlformats.org/drawingml/2006/picture">
-                  <wp:extent cx="2697479" cy="1329651"/>
+                  <wp:extent cx="2697479" cy="1322802"/>
                   <wp:docPr id="6" name="Picture 6"/>
                   <wp:cNvGraphicFramePr>
                     <a:graphicFrameLocks noChangeAspect="1"/>
@@ -5805,7 +5805,7 @@
                         <pic:spPr>
                           <a:xfrm>
                             <a:off x="0" y="0"/>
-                            <a:ext cx="2697479" cy="1329651"/>
+                            <a:ext cx="2697479" cy="1322802"/>
                           </a:xfrm>
                           <a:prstGeom prst="rect"/>
                         </pic:spPr>

</xml_diff>